<commit_message>
add supp table and edit figures
</commit_message>
<xml_diff>
--- a/Manuscript/Figures_Manuscript_V05.docx
+++ b/Manuscript/Figures_Manuscript_V05.docx
@@ -942,19 +942,7 @@
         <w:rPr>
           <w:rFonts w:cs="Arial" w:ascii="Arial" w:hAnsi="Arial"/>
         </w:rPr>
-        <w:t>)</w:t>
-      </w:r>
-      <w:r>
-        <w:rPr>
-          <w:rFonts w:cs="Arial" w:ascii="Arial" w:hAnsi="Arial"/>
-        </w:rPr>
-        <w:t>Schema that employs NCT survey and technical replicates for the benchmarking of various decontamination methods (more details in Materials and Methods section)</w:t>
-      </w:r>
-      <w:r>
-        <w:rPr>
-          <w:rFonts w:cs="Arial" w:ascii="Arial" w:hAnsi="Arial"/>
-        </w:rPr>
-        <w:t xml:space="preserve">. </w:t>
+        <w:t xml:space="preserve">)Schema that employs NCT survey and technical replicates for the benchmarking of various decontamination methods (more details in Materials and Methods section). </w:t>
       </w:r>
       <w:r>
         <w:rPr>
@@ -962,33 +950,13 @@
           <w:b/>
           <w:bCs/>
         </w:rPr>
-        <w:t>B-</w:t>
-      </w:r>
-      <w:r>
-        <w:rPr>
-          <w:rFonts w:cs="Arial" w:ascii="Arial" w:hAnsi="Arial"/>
-          <w:b/>
-          <w:bCs/>
-        </w:rPr>
-        <w:t>D</w:t>
-      </w:r>
-      <w:r>
-        <w:rPr>
-          <w:rFonts w:cs="Arial" w:ascii="Arial" w:hAnsi="Arial"/>
-        </w:rPr>
-        <w:t xml:space="preserve">) Comparison of the four decontamination methods and ND profile using a Wilcoxon signed-rank test based on a composite score, </w:t>
-      </w:r>
-      <w:r>
-        <w:rPr>
-          <w:rFonts w:cs="Arial" w:ascii="Arial" w:hAnsi="Arial"/>
-        </w:rPr>
-        <w:t>inter-replicate distance, and compositional overlap ratio respectively.</w:t>
-      </w:r>
-      <w:r>
-        <w:rPr>
-          <w:rFonts w:cs="Arial" w:ascii="Arial" w:hAnsi="Arial"/>
-        </w:rPr>
-        <w:t xml:space="preserve"> </w:t>
+        <w:t>B-D</w:t>
+      </w:r>
+      <w:r>
+        <w:rPr>
+          <w:rFonts w:cs="Arial" w:ascii="Arial" w:hAnsi="Arial"/>
+        </w:rPr>
+        <w:t xml:space="preserve">) Comparison of the four decontamination methods and ND profile using a Wilcoxon signed-rank test based on a composite score, inter-replicate distance, and compositional overlap ratio respectively. </w:t>
       </w:r>
       <w:ins w:id="0" w:author="Linh Dang" w:date="2026-08-05T14:08:42Z">
         <w:r>

</xml_diff>

<commit_message>
add new manuscript version
</commit_message>
<xml_diff>
--- a/Manuscript/Figures_Manuscript_V05.docx
+++ b/Manuscript/Figures_Manuscript_V05.docx
@@ -950,23 +950,87 @@
           <w:b/>
           <w:bCs/>
         </w:rPr>
-        <w:t>B-D</w:t>
-      </w:r>
-      <w:r>
-        <w:rPr>
-          <w:rFonts w:cs="Arial" w:ascii="Arial" w:hAnsi="Arial"/>
-        </w:rPr>
-        <w:t xml:space="preserve">) Comparison of the four decontamination methods and ND profile using a Wilcoxon signed-rank test based on a composite score, inter-replicate distance, and compositional overlap ratio respectively. </w:t>
-      </w:r>
-      <w:ins w:id="0" w:author="Linh Dang" w:date="2026-08-05T14:08:42Z">
+        <w:t>B-</w:t>
+      </w:r>
+      <w:ins w:id="0" w:author="Linh Dang" w:date="2026-08-10T11:47:13Z">
+        <w:r>
+          <w:rPr>
+            <w:rFonts w:cs="Arial" w:ascii="Arial" w:hAnsi="Arial"/>
+            <w:b/>
+            <w:bCs/>
+          </w:rPr>
+          <w:t>C</w:t>
+        </w:r>
+      </w:ins>
+      <w:del w:id="1" w:author="Linh Dang" w:date="2026-08-10T11:47:12Z">
+        <w:r>
+          <w:rPr>
+            <w:rFonts w:cs="Arial" w:ascii="Arial" w:hAnsi="Arial"/>
+            <w:b/>
+            <w:bCs/>
+          </w:rPr>
+          <w:delText>D</w:delText>
+        </w:r>
+      </w:del>
+      <w:r>
+        <w:rPr>
+          <w:rFonts w:cs="Arial" w:ascii="Arial" w:hAnsi="Arial"/>
+        </w:rPr>
+        <w:t>) Comparison of the four decontamination methods and ND profile using a Wilcoxon signed-rank test based on a composite score</w:t>
+      </w:r>
+      <w:ins w:id="2" w:author="Linh Dang" w:date="2026-08-10T11:47:35Z">
         <w:r>
           <w:rPr>
             <w:rFonts w:cs="Arial" w:ascii="Arial" w:hAnsi="Arial"/>
           </w:rPr>
-          <w:t xml:space="preserve">In composite score and compositional overlap ratio, the higher value indicates better </w:t>
+          <w:t xml:space="preserve"> </w:t>
         </w:r>
       </w:ins>
-      <w:ins w:id="1" w:author="Linh Dang" w:date="2026-08-05T14:08:42Z">
+      <w:ins w:id="3" w:author="Linh Dang" w:date="2026-08-10T11:47:35Z">
+        <w:r>
+          <w:rPr>
+            <w:rFonts w:cs="Arial" w:ascii="Arial" w:hAnsi="Arial"/>
+          </w:rPr>
+          <w:t>and</w:t>
+        </w:r>
+      </w:ins>
+      <w:del w:id="4" w:author="Linh Dang" w:date="2026-08-10T11:47:34Z">
+        <w:r>
+          <w:rPr>
+            <w:rFonts w:cs="Arial" w:ascii="Arial" w:hAnsi="Arial"/>
+          </w:rPr>
+          <w:delText>,</w:delText>
+        </w:r>
+      </w:del>
+      <w:r>
+        <w:rPr>
+          <w:rFonts w:cs="Arial" w:ascii="Arial" w:hAnsi="Arial"/>
+        </w:rPr>
+        <w:t xml:space="preserve"> inter-replicate distance</w:t>
+      </w:r>
+      <w:del w:id="5" w:author="Linh Dang" w:date="2026-08-10T11:47:29Z">
+        <w:r>
+          <w:rPr>
+            <w:rFonts w:cs="Arial" w:ascii="Arial" w:hAnsi="Arial"/>
+          </w:rPr>
+          <w:delText>, and compositional overlap ratio respectively</w:delText>
+        </w:r>
+      </w:del>
+      <w:r>
+        <w:rPr>
+          <w:rFonts w:cs="Arial" w:ascii="Arial" w:hAnsi="Arial"/>
+        </w:rPr>
+        <w:t xml:space="preserve">. </w:t>
+      </w:r>
+      <w:ins w:id="6" w:author="Linh Dang" w:date="2026-08-05T14:08:42Z">
+        <w:r>
+          <w:rPr>
+            <w:rFonts w:cs="Arial" w:ascii="Arial" w:hAnsi="Arial"/>
+          </w:rPr>
+          <w:t xml:space="preserve">In composite score, the higher value indicates better </w:t>
+        </w:r>
+      </w:ins>
+      <w:ins w:id="7" w:author="Linh Dang" w:date="2026-08-05T14:08:42Z">
         <w:r>
           <w:rPr>
             <w:rFonts w:eastAsia="Noto Serif CJK SC" w:cs="Arial" w:ascii="Arial" w:hAnsi="Arial"/>
@@ -980,7 +1044,7 @@
           <w:t>performance.</w:t>
         </w:r>
       </w:ins>
-      <w:ins w:id="2" w:author="Linh Dang" w:date="2026-08-05T14:08:42Z">
+      <w:ins w:id="8" w:author="Linh Dang" w:date="2026-08-05T14:08:42Z">
         <w:r>
           <w:rPr>
             <w:rFonts w:cs="Arial" w:ascii="Arial" w:hAnsi="Arial"/>
@@ -988,7 +1052,7 @@
           <w:t xml:space="preserve"> On the other hand, lower value in inter-replicate distance reflects a better performance. </w:t>
         </w:r>
       </w:ins>
-      <w:del w:id="3" w:author="Linh Dang" w:date="2026-08-05T14:04:11Z">
+      <w:del w:id="9" w:author="Linh Dang" w:date="2026-08-05T14:04:11Z">
         <w:r>
           <w:rPr>
             <w:rFonts w:cs="Arial" w:ascii="Arial" w:hAnsi="Arial"/>
@@ -996,7 +1060,7 @@
           <w:delText xml:space="preserve">integrating sample bacterial profiles and the longitudinal NCT survey. Higher scores indicate better performance. </w:delText>
         </w:r>
       </w:del>
-      <w:del w:id="4" w:author="Linh Dang" w:date="2026-08-05T14:04:11Z">
+      <w:del w:id="10" w:author="Linh Dang" w:date="2026-08-05T14:04:11Z">
         <w:r>
           <w:rPr>
             <w:rFonts w:cs="Arial" w:ascii="Arial" w:hAnsi="Arial"/>
@@ -1006,7 +1070,7 @@
           <w:delText>C</w:delText>
         </w:r>
       </w:del>
-      <w:del w:id="5" w:author="Linh Dang" w:date="2026-08-05T14:04:11Z">
+      <w:del w:id="11" w:author="Linh Dang" w:date="2026-08-05T14:04:11Z">
         <w:r>
           <w:rPr>
             <w:rFonts w:cs="Arial" w:ascii="Arial" w:hAnsi="Arial"/>
@@ -1014,7 +1078,7 @@
           <w:delText xml:space="preserve">) Comparison of decontamination methods based on the compositional distance between technical replicates. Inter-replicate dissimilarity was quantified using Aitchison distance of centered-log ratio transformed data, with pairwise comparisons assessed by paired Wilcoxon signed-rank test on species level. Lower inter-replicate distances indicate higher performance. </w:delText>
         </w:r>
       </w:del>
-      <w:del w:id="6" w:author="Linh Dang" w:date="2026-08-05T14:04:11Z">
+      <w:del w:id="12" w:author="Linh Dang" w:date="2026-08-05T14:04:11Z">
         <w:r>
           <w:rPr>
             <w:rFonts w:cs="Arial" w:ascii="Arial" w:hAnsi="Arial"/>
@@ -1024,7 +1088,7 @@
           <w:delText>D</w:delText>
         </w:r>
       </w:del>
-      <w:del w:id="7" w:author="Linh Dang" w:date="2026-08-05T14:04:11Z">
+      <w:del w:id="13" w:author="Linh Dang" w:date="2026-08-05T14:04:11Z">
         <w:r>
           <w:rPr>
             <w:rFonts w:cs="Arial" w:ascii="Arial" w:hAnsi="Arial"/>
@@ -1032,13 +1096,13 @@
           <w:delText>)</w:delText>
         </w:r>
       </w:del>
-      <w:del w:id="8" w:author="Linh Dang" w:date="2026-08-05T14:04:11Z">
+      <w:del w:id="14" w:author="Linh Dang" w:date="2026-08-05T14:04:11Z">
         <w:r>
           <w:rPr/>
           <w:delText xml:space="preserve"> </w:delText>
         </w:r>
       </w:del>
-      <w:del w:id="9" w:author="Linh Dang" w:date="2026-08-05T14:04:11Z">
+      <w:del w:id="15" w:author="Linh Dang" w:date="2026-08-05T14:04:11Z">
         <w:r>
           <w:rPr>
             <w:rFonts w:cs="Arial" w:ascii="Arial" w:hAnsi="Arial"/>
@@ -1046,14 +1110,24 @@
           <w:delText xml:space="preserve">Compositional overlap between non-normalized replicates was defined as the proportion of shared taxa relative to the total taxa detected across both replicates. Higher overlap ratios reflect better performance. </w:delText>
         </w:r>
       </w:del>
-      <w:r>
-        <w:rPr>
-          <w:rFonts w:cs="Arial" w:ascii="Arial" w:hAnsi="Arial"/>
-          <w:b/>
-          <w:bCs/>
-        </w:rPr>
-        <w:t>E</w:t>
-      </w:r>
+      <w:ins w:id="16" w:author="Linh Dang" w:date="2026-08-10T11:48:10Z">
+        <w:r>
+          <w:rPr>
+            <w:rFonts w:cs="Arial" w:ascii="Arial" w:hAnsi="Arial"/>
+          </w:rPr>
+          <w:t>D</w:t>
+        </w:r>
+      </w:ins>
+      <w:del w:id="17" w:author="Linh Dang" w:date="2026-08-10T11:48:09Z">
+        <w:r>
+          <w:rPr>
+            <w:rFonts w:cs="Arial" w:ascii="Arial" w:hAnsi="Arial"/>
+            <w:b/>
+            <w:bCs/>
+          </w:rPr>
+          <w:delText>E</w:delText>
+        </w:r>
+      </w:del>
       <w:r>
         <w:rPr>
           <w:rFonts w:cs="Arial" w:ascii="Arial" w:hAnsi="Arial"/>
@@ -1154,7 +1228,7 @@
                                         </pic:nvPicPr>
                                         <pic:blipFill>
                                           <a:blip r:embed="rId8"/>
-                                          <a:srcRect l="-57" t="-42" r="-57" b="-42"/>
+                                          <a:srcRect l="-58" t="-63" r="-58" b="-63"/>
                                           <a:stretch>
                                             <a:fillRect/>
                                           </a:stretch>
@@ -1224,7 +1298,7 @@
                                   </pic:nvPicPr>
                                   <pic:blipFill>
                                     <a:blip r:embed="rId9"/>
-                                    <a:srcRect l="-57" t="-42" r="-57" b="-42"/>
+                                    <a:srcRect l="-58" t="-63" r="-58" b="-63"/>
                                     <a:stretch>
                                       <a:fillRect/>
                                     </a:stretch>
@@ -1299,114 +1373,207 @@
         </w:rPr>
         <w:t xml:space="preserve"> </w:t>
       </w:r>
+      <w:del w:id="18" w:author="Linh Dang" w:date="2026-08-10T13:05:44Z">
+        <w:r>
+          <w:rPr>
+            <w:rStyle w:val="Strong"/>
+            <w:rFonts w:cs="Arial" w:ascii="Arial" w:hAnsi="Arial"/>
+            <w:i w:val="false"/>
+          </w:rPr>
+          <w:delText>A)</w:delText>
+        </w:r>
+      </w:del>
+      <w:del w:id="19" w:author="Linh Dang" w:date="2026-08-10T13:05:44Z">
+        <w:r>
+          <w:rPr>
+            <w:rFonts w:cs="Arial" w:ascii="Arial" w:hAnsi="Arial"/>
+            <w:i w:val="false"/>
+          </w:rPr>
+          <w:delText xml:space="preserve"> Schematic overview of the study design: Ten paired tumor from KPC mice were profiled by whole 16S rRNA sequencing using both FF and FFPE samples from same tumors. Two independent sequencing runs were performed for the FF samples to generate technical replicates. </w:delText>
+        </w:r>
+      </w:del>
+      <w:ins w:id="20" w:author="Linh Dang" w:date="2026-08-10T13:05:45Z">
+        <w:r>
+          <w:rPr>
+            <w:rFonts w:cs="Arial" w:ascii="Arial" w:hAnsi="Arial"/>
+            <w:i w:val="false"/>
+          </w:rPr>
+          <w:t>A</w:t>
+        </w:r>
+      </w:ins>
+      <w:del w:id="21" w:author="Linh Dang" w:date="2026-08-10T13:05:44Z">
+        <w:r>
+          <w:rPr>
+            <w:rStyle w:val="Strong"/>
+            <w:rFonts w:cs="Arial" w:ascii="Arial" w:hAnsi="Arial"/>
+            <w:i w:val="false"/>
+          </w:rPr>
+          <w:delText>B</w:delText>
+        </w:r>
+      </w:del>
       <w:r>
         <w:rPr>
           <w:rStyle w:val="Strong"/>
           <w:rFonts w:cs="Arial" w:ascii="Arial" w:hAnsi="Arial"/>
           <w:i w:val="false"/>
         </w:rPr>
-        <w:t>A)</w:t>
+        <w:t>)</w:t>
       </w:r>
       <w:r>
         <w:rPr>
           <w:rFonts w:cs="Arial" w:ascii="Arial" w:hAnsi="Arial"/>
           <w:i w:val="false"/>
         </w:rPr>
-        <w:t xml:space="preserve"> Schematic overview of the study design: Ten paired tumor from KPC mice were profiled by whole 16S rRNA sequencing using both FF and FFPE samples from same tumors. Two independent sequencing runs were performed for the FF samples to generate technical replicates. </w:t>
-      </w:r>
+        <w:t xml:space="preserve"> Alpha diversity analyses comparing FFPE samples and the two FF technical replicates across the non-decontaminated (ND) data and four decontamination strategies: restrictive, decontam, SCRuB, and Nejman (Nj) et al derived method </w:t>
+      </w:r>
+      <w:r>
+        <w:fldChar w:fldCharType="begin"/>
+      </w:r>
+      <w:r>
+        <w:rPr>
+          <w:i w:val="false"/>
+          <w:rFonts w:cs="Arial" w:ascii="Arial" w:hAnsi="Arial"/>
+        </w:rPr>
+        <w:instrText xml:space="preserve">ADDIN CitaviPlaceholder{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}</w:instrText>
+      </w:r>
+      <w:r>
+        <w:rPr>
+          <w:rFonts w:cs="Arial" w:ascii="Arial" w:hAnsi="Arial"/>
+          <w:i w:val="false"/>
+        </w:rPr>
+      </w:r>
+      <w:r>
+        <w:rPr>
+          <w:i w:val="false"/>
+          <w:rFonts w:cs="Arial" w:ascii="Arial" w:hAnsi="Arial"/>
+        </w:rPr>
+        <w:fldChar w:fldCharType="separate"/>
+      </w:r>
+      <w:r>
+        <w:rPr>
+          <w:rFonts w:cs="Arial" w:ascii="Arial" w:hAnsi="Arial"/>
+          <w:i w:val="false"/>
+        </w:rPr>
+        <w:t>(6)</w:t>
+      </w:r>
+      <w:r>
+        <w:rPr>
+          <w:rFonts w:cs="Arial" w:ascii="Arial" w:hAnsi="Arial"/>
+          <w:i w:val="false"/>
+        </w:rPr>
+      </w:r>
+      <w:r>
+        <w:rPr>
+          <w:i w:val="false"/>
+          <w:rFonts w:cs="Arial" w:ascii="Arial" w:hAnsi="Arial"/>
+        </w:rPr>
+        <w:fldChar w:fldCharType="end"/>
+      </w:r>
+      <w:r>
+        <w:rPr>
+          <w:rFonts w:cs="Arial" w:ascii="Arial" w:hAnsi="Arial"/>
+        </w:rPr>
+        <w:t>.</w:t>
+      </w:r>
+      <w:r>
+        <w:rPr>
+          <w:rFonts w:cs="Arial" w:ascii="Arial" w:hAnsi="Arial"/>
+          <w:i w:val="false"/>
+        </w:rPr>
+        <w:t xml:space="preserve"> Diversity was assessed using the number of observed species and the Shannon index. Univariable negative binomial regression for number of observed species and multivariable linear regression for Shannon index were applied. </w:t>
+      </w:r>
+      <w:ins w:id="22" w:author="Linh Dang" w:date="2026-08-10T13:09:42Z">
+        <w:r>
+          <w:rPr>
+            <w:rFonts w:cs="Arial" w:ascii="Arial" w:hAnsi="Arial"/>
+            <w:i w:val="false"/>
+          </w:rPr>
+          <w:t>B</w:t>
+        </w:r>
+      </w:ins>
+      <w:del w:id="23" w:author="Linh Dang" w:date="2026-08-10T13:09:41Z">
+        <w:r>
+          <w:rPr>
+            <w:rStyle w:val="Strong"/>
+            <w:rFonts w:cs="Arial" w:ascii="Arial" w:hAnsi="Arial"/>
+            <w:i w:val="false"/>
+          </w:rPr>
+          <w:delText>C</w:delText>
+        </w:r>
+      </w:del>
       <w:r>
         <w:rPr>
           <w:rStyle w:val="Strong"/>
           <w:rFonts w:cs="Arial" w:ascii="Arial" w:hAnsi="Arial"/>
           <w:i w:val="false"/>
         </w:rPr>
-        <w:t>B)</w:t>
+        <w:t>)</w:t>
       </w:r>
       <w:r>
         <w:rPr>
           <w:rFonts w:cs="Arial" w:ascii="Arial" w:hAnsi="Arial"/>
           <w:i w:val="false"/>
         </w:rPr>
-        <w:t xml:space="preserve"> Alpha diversity analyses comparing FFPE samples and the two FF technical replicates across the non-decontaminated (ND) data and four decontamination strategies: restrictive, decontam, SCRuB, and Nejman (Nj) et al derived method </w:t>
-      </w:r>
-      <w:r>
-        <w:fldChar w:fldCharType="begin"/>
-      </w:r>
-      <w:r>
-        <w:rPr>
+        <w:t xml:space="preserve"> Bray-Curtis dissimilarity of the two FF technical replicates and paired FFPE samples. Samples are colored and grouped by technical replicate. Analyses were performed using </w:t>
+      </w:r>
+      <w:del w:id="24" w:author="Linh Dang" w:date="2026-08-10T13:10:21Z">
+        <w:r>
+          <w:rPr>
+            <w:rFonts w:cs="Arial" w:ascii="Arial" w:hAnsi="Arial"/>
+            <w:i w:val="false"/>
+          </w:rPr>
+          <w:delText>both</w:delText>
+        </w:r>
+      </w:del>
+      <w:r>
+        <w:rPr>
+          <w:rFonts w:cs="Arial" w:ascii="Arial" w:hAnsi="Arial"/>
           <w:i w:val="false"/>
-          <w:rFonts w:cs="Arial" w:ascii="Arial" w:hAnsi="Arial"/>
-        </w:rPr>
-        <w:instrText xml:space="preserve">ADDIN CitaviPlaceholder{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}</w:instrText>
-      </w:r>
+        </w:rPr>
+        <w:t xml:space="preserve"> Wrench normalization</w:t>
+      </w:r>
+      <w:del w:id="25" w:author="Linh Dang" w:date="2026-08-10T13:10:26Z">
+        <w:r>
+          <w:rPr>
+            <w:rFonts w:cs="Arial" w:ascii="Arial" w:hAnsi="Arial"/>
+            <w:i w:val="false"/>
+          </w:rPr>
+          <w:delText xml:space="preserve"> and rarefaction</w:delText>
+        </w:r>
+      </w:del>
       <w:r>
         <w:rPr>
           <w:rFonts w:cs="Arial" w:ascii="Arial" w:hAnsi="Arial"/>
           <w:i w:val="false"/>
         </w:rPr>
-      </w:r>
-      <w:r>
-        <w:rPr>
+        <w:t xml:space="preserve">. The plot is ordinated with Principal Coordinate Analysis (PCoA) and p-values were calculated by PERMANOVA. </w:t>
+      </w:r>
+      <w:ins w:id="26" w:author="Linh Dang" w:date="2026-08-10T13:10:35Z">
+        <w:r>
+          <w:rPr>
+            <w:rFonts w:cs="Arial" w:ascii="Arial" w:hAnsi="Arial"/>
+            <w:i w:val="false"/>
+          </w:rPr>
+          <w:t>C</w:t>
+        </w:r>
+      </w:ins>
+      <w:del w:id="27" w:author="Linh Dang" w:date="2026-08-10T13:10:34Z">
+        <w:r>
+          <w:rPr>
+            <w:rStyle w:val="Strong"/>
+            <w:rFonts w:cs="Arial" w:ascii="Arial" w:hAnsi="Arial"/>
+            <w:i w:val="false"/>
+          </w:rPr>
+          <w:delText>D</w:delText>
+        </w:r>
+      </w:del>
+      <w:r>
+        <w:rPr>
+          <w:rStyle w:val="Strong"/>
+          <w:rFonts w:cs="Arial" w:ascii="Arial" w:hAnsi="Arial"/>
           <w:i w:val="false"/>
-          <w:rFonts w:cs="Arial" w:ascii="Arial" w:hAnsi="Arial"/>
-        </w:rPr>
-        <w:fldChar w:fldCharType="separate"/>
-      </w:r>
-      <w:r>
-        <w:rPr>
-          <w:rFonts w:cs="Arial" w:ascii="Arial" w:hAnsi="Arial"/>
-          <w:i w:val="false"/>
-        </w:rPr>
-        <w:t>(6)</w:t>
-      </w:r>
-      <w:r>
-        <w:rPr>
-          <w:rFonts w:cs="Arial" w:ascii="Arial" w:hAnsi="Arial"/>
-          <w:i w:val="false"/>
-        </w:rPr>
-      </w:r>
-      <w:r>
-        <w:rPr>
-          <w:i w:val="false"/>
-          <w:rFonts w:cs="Arial" w:ascii="Arial" w:hAnsi="Arial"/>
-        </w:rPr>
-        <w:fldChar w:fldCharType="end"/>
-      </w:r>
-      <w:r>
-        <w:rPr>
-          <w:rFonts w:cs="Arial" w:ascii="Arial" w:hAnsi="Arial"/>
-        </w:rPr>
-        <w:t>.</w:t>
-      </w:r>
-      <w:r>
-        <w:rPr>
-          <w:rFonts w:cs="Arial" w:ascii="Arial" w:hAnsi="Arial"/>
-          <w:i w:val="false"/>
-        </w:rPr>
-        <w:t xml:space="preserve"> Diversity was assessed using the number of observed species and the Shannon index. Univariable negative binomial regression for number of observed species and multivariable linear regression for Shannon index were applied. </w:t>
-      </w:r>
-      <w:r>
-        <w:rPr>
-          <w:rStyle w:val="Strong"/>
-          <w:rFonts w:cs="Arial" w:ascii="Arial" w:hAnsi="Arial"/>
-          <w:i w:val="false"/>
-        </w:rPr>
-        <w:t>C)</w:t>
-      </w:r>
-      <w:r>
-        <w:rPr>
-          <w:rFonts w:cs="Arial" w:ascii="Arial" w:hAnsi="Arial"/>
-          <w:i w:val="false"/>
-        </w:rPr>
-        <w:t xml:space="preserve"> Bray-Curtis dissimilarity of the two FF technical replicates and paired FFPE samples. Samples are colored and grouped by technical replicate. Analyses were performed using both Wrench normalization and rarefaction. The plot is ordinated with Principal Coordinate Analysis (PCoA) and p-values were calculated by PERMANOVA. </w:t>
-      </w:r>
-      <w:r>
-        <w:rPr>
-          <w:rStyle w:val="Strong"/>
-          <w:rFonts w:cs="Arial" w:ascii="Arial" w:hAnsi="Arial"/>
-          <w:i w:val="false"/>
-        </w:rPr>
-        <w:t>D)</w:t>
+        </w:rPr>
+        <w:t>)</w:t>
       </w:r>
       <w:r>
         <w:rPr>

</xml_diff>